<commit_message>
Poles akhir: bersihkan catatan draft & narasi proses di notebook, rapikan Appendix C report
</commit_message>
<xml_diff>
--- a/phase5/Knowledge_Discovery_Report.docx
+++ b/phase5/Knowledge_Discovery_Report.docx
@@ -4795,7 +4795,7 @@
               <w:rPr>
                 <w:sz w:val="13"/>
               </w:rPr>
-              <w:t>Income tidak plausibel utk pinjaman konsumen; salah entri — koreksi/keluarkan</w:t>
+              <w:t>Salah entri income — koreksi / keluarkan</w:t>
             </w:r>
           </w:p>
         </w:tc>
@@ -4951,7 +4951,7 @@
               <w:rPr>
                 <w:sz w:val="13"/>
               </w:rPr>
-              <w:t>Income tidak plausibel utk pinjaman konsumen; salah entri — koreksi/keluarkan</w:t>
+              <w:t>Salah entri income — koreksi / keluarkan</w:t>
             </w:r>
           </w:p>
         </w:tc>
@@ -5107,7 +5107,7 @@
               <w:rPr>
                 <w:sz w:val="13"/>
               </w:rPr>
-              <w:t>Income tidak plausibel utk pinjaman konsumen; salah entri — koreksi/keluarkan</w:t>
+              <w:t>Salah entri income — koreksi / keluarkan</w:t>
             </w:r>
           </w:p>
         </w:tc>
@@ -5263,7 +5263,7 @@
               <w:rPr>
                 <w:sz w:val="13"/>
               </w:rPr>
-              <w:t>Income tidak plausibel utk pinjaman konsumen; salah entri — koreksi/keluarkan</w:t>
+              <w:t>Salah entri income — koreksi / keluarkan</w:t>
             </w:r>
           </w:p>
         </w:tc>
@@ -5419,7 +5419,7 @@
               <w:rPr>
                 <w:sz w:val="13"/>
               </w:rPr>
-              <w:t>Income tidak plausibel utk pinjaman konsumen; salah entri — koreksi/keluarkan</w:t>
+              <w:t>Salah entri income — koreksi / keluarkan</w:t>
             </w:r>
           </w:p>
         </w:tc>
@@ -5575,7 +5575,7 @@
               <w:rPr>
                 <w:sz w:val="13"/>
               </w:rPr>
-              <w:t>Income tidak plausibel utk pinjaman konsumen; salah entri — koreksi/keluarkan</w:t>
+              <w:t>Salah entri income — koreksi / keluarkan</w:t>
             </w:r>
           </w:p>
         </w:tc>
@@ -5731,7 +5731,7 @@
               <w:rPr>
                 <w:sz w:val="13"/>
               </w:rPr>
-              <w:t>Tekanan kredit tinggi (DTI/utilisasi/inquiry) — flag review manual underwriting</w:t>
+              <w:t>Tekanan kredit tinggi — review manual</w:t>
             </w:r>
           </w:p>
         </w:tc>
@@ -5887,7 +5887,7 @@
               <w:rPr>
                 <w:sz w:val="13"/>
               </w:rPr>
-              <w:t>Tekanan kredit tinggi (DTI/utilisasi/inquiry) — flag review manual underwriting</w:t>
+              <w:t>Tekanan kredit tinggi — review manual</w:t>
             </w:r>
           </w:p>
         </w:tc>
@@ -6043,7 +6043,7 @@
               <w:rPr>
                 <w:sz w:val="13"/>
               </w:rPr>
-              <w:t>Tekanan kredit tinggi (DTI/utilisasi/inquiry) — flag review manual underwriting</w:t>
+              <w:t>Tekanan kredit tinggi — review manual</w:t>
             </w:r>
           </w:p>
         </w:tc>
@@ -6199,7 +6199,7 @@
               <w:rPr>
                 <w:sz w:val="13"/>
               </w:rPr>
-              <w:t>Tekanan kredit tinggi (DTI/utilisasi/inquiry) — flag review manual underwriting</w:t>
+              <w:t>Tekanan kredit tinggi — review manual</w:t>
             </w:r>
           </w:p>
         </w:tc>
@@ -6355,7 +6355,7 @@
               <w:rPr>
                 <w:sz w:val="13"/>
               </w:rPr>
-              <w:t>Tekanan kredit tinggi (DTI/utilisasi/inquiry) — flag review manual underwriting</w:t>
+              <w:t>Tekanan kredit tinggi — review manual</w:t>
             </w:r>
           </w:p>
         </w:tc>
@@ -6511,7 +6511,7 @@
               <w:rPr>
                 <w:sz w:val="13"/>
               </w:rPr>
-              <w:t>Tekanan kredit tinggi (DTI/utilisasi/inquiry) — flag review manual underwriting</w:t>
+              <w:t>Tekanan kredit tinggi — review manual</w:t>
             </w:r>
           </w:p>
         </w:tc>
@@ -6667,7 +6667,7 @@
               <w:rPr>
                 <w:sz w:val="13"/>
               </w:rPr>
-              <w:t>Affluent/limit besar, plausibel &amp; mayoritas lancar — jangan tolak otomatis</w:t>
+              <w:t>Affluent &amp; lancar — jangan tolak otomatis</w:t>
             </w:r>
           </w:p>
         </w:tc>
@@ -6823,7 +6823,7 @@
               <w:rPr>
                 <w:sz w:val="13"/>
               </w:rPr>
-              <w:t>Affluent/limit besar, plausibel &amp; mayoritas lancar — jangan tolak otomatis</w:t>
+              <w:t>Affluent &amp; lancar — jangan tolak otomatis</w:t>
             </w:r>
           </w:p>
         </w:tc>
@@ -6979,7 +6979,7 @@
               <w:rPr>
                 <w:sz w:val="13"/>
               </w:rPr>
-              <w:t>Affluent/limit besar, plausibel &amp; mayoritas lancar — jangan tolak otomatis</w:t>
+              <w:t>Affluent &amp; lancar — jangan tolak otomatis</w:t>
             </w:r>
           </w:p>
         </w:tc>
@@ -7135,7 +7135,7 @@
               <w:rPr>
                 <w:sz w:val="13"/>
               </w:rPr>
-              <w:t>Affluent/limit besar, plausibel &amp; mayoritas lancar — jangan tolak otomatis</w:t>
+              <w:t>Affluent &amp; lancar — jangan tolak otomatis</w:t>
             </w:r>
           </w:p>
         </w:tc>
@@ -7291,7 +7291,7 @@
               <w:rPr>
                 <w:sz w:val="13"/>
               </w:rPr>
-              <w:t>Affluent/limit besar, plausibel &amp; mayoritas lancar — jangan tolak otomatis</w:t>
+              <w:t>Affluent &amp; lancar — jangan tolak otomatis</w:t>
             </w:r>
           </w:p>
         </w:tc>
@@ -7447,7 +7447,7 @@
               <w:rPr>
                 <w:sz w:val="13"/>
               </w:rPr>
-              <w:t>Affluent/limit besar, plausibel &amp; mayoritas lancar — jangan tolak otomatis</w:t>
+              <w:t>Affluent &amp; lancar — jangan tolak otomatis</w:t>
             </w:r>
           </w:p>
         </w:tc>

</xml_diff>

<commit_message>
Sinkron hasil Run All + kompatibilitas dtype pandas 3 + istilah teknis Inggris
- Guard konversi tipe di notebook & pipeline Phase 1 dibuat dtype-agnostik
  (is_numeric_dtype, bukan dtype=='object'); memperbaiki ValueError ' 36 months'
  saat dijalankan di pandas 3 yang membaca teks sebagai dtype 'string'.
  Tervalidasi: pipeline lolos penuh dgn future.infer_string aktif
- Angka Phase 2 hasil re-run disinkronkan ke seluruh artefak: 62,2/37,8 persen,
  charged-off 14,4/7,7, ARI 0,365, SD-gap FICO 1,16 & income 0,34
  (report, dashboard, data_layer, CSV dashboard diregenerasi)
- Istilah transliterasi janggal diganti bentuk Inggris standar: corroboration,
  co-occurrence, circular(ity), collapse, feasible, winsorization, arbitrary
  (source & stored output disinkronkan agar tidak ada mismatch)
- Nama notebook mengikuti penamaan baru (tanpa -v2) di README & dokumen
</commit_message>
<xml_diff>
--- a/phase5/Knowledge_Discovery_Report.docx
+++ b/phase5/Knowledge_Discovery_Report.docx
@@ -433,7 +433,7 @@
           <w:b w:val="0"/>
           <w:i w:val="0"/>
         </w:rPr>
-        <w:t>Analisis KDD atas 2.260.668 pinjaman Lending Club menemukan bahwa risiko gagal bayar terkonsentrasi pada segmen mayoritas: 62,1 persen peminjam berada dalam satu segmen dengan tingkat charged-off 14,4 persen, hampir dua kali lipat segmen prime (7,8 persen), dan segmen ini terpisah paling tajam pada kombinasi FICO, utilisasi revolving, dan ukuran pinjaman. Dua hal yang belum tercermin dalam praktik saat ini: grade internal hampir sepenuhnya cerminan suku bunga (hanya 1 dari 1.023 aturan asosiasi yang memprediksi Grade A tanpa suku bunga), dan outlier statistik justru didominasi nasabah affluent yang membayar lancar (bad-rate 8,7 persen vs populasi 13,1 persen). Bank sebaiknya mengkalibrasi harga dan limit pada kombinasi atribut tersebut, dan mengganti flag berbasis outlier dengan aturan kombinasi atribut tekanan kredit yang tervalidasi menaikkan risiko gagal bayar 1,47 kali (19,2 persen).</w:t>
+        <w:t>Analisis KDD atas 2.260.668 pinjaman Lending Club menemukan bahwa risiko gagal bayar terkonsentrasi pada segmen mayoritas: 62,2 persen peminjam berada dalam satu segmen dengan tingkat charged-off 14,4 persen, hampir dua kali lipat segmen prime (7,7 persen), dan segmen ini terpisah paling tajam pada kombinasi FICO, utilisasi revolving, dan ukuran pinjaman. Dua hal yang belum tercermin dalam praktik saat ini: grade internal hampir sepenuhnya cerminan suku bunga (hanya 1 dari 1.023 aturan asosiasi yang memprediksi Grade A tanpa suku bunga), dan outlier statistik justru didominasi nasabah affluent yang membayar lancar (bad-rate 8,7 persen vs populasi 13,1 persen). Bank sebaiknya mengkalibrasi harga dan limit pada kombinasi atribut tersebut, dan mengganti flag berbasis outlier dengan aturan kombinasi atribut tekanan kredit yang tervalidasi menaikkan risiko gagal bayar 1,47 kali (19,2 persen).</w:t>
       </w:r>
     </w:p>
     <w:p>
@@ -458,7 +458,7 @@
           <w:b w:val="0"/>
           <w:i w:val="0"/>
         </w:rPr>
-        <w:t>Lending Club Accepted Loans 2007–2018Q4, diunduh dari Kaggle (kaggle.com/datasets/wordsforthewise/lending-club), domain peer-to-peer lending dan risiko kredit konsumen. Seluruh 2.260.668 record dipakai (151 kolom mentah; 12 fitur final setelah feature selection). Sampling hanya dilakukan untuk komputasi yang tidak traktabel pada data penuh, selalu acak dan seeded (seed 42): mutual information 50.000 baris, UMAP 100.000, hierarchical clustering 12.000, dan Apriori 250.000.</w:t>
+        <w:t>Lending Club Accepted Loans 2007–2018Q4, diunduh dari Kaggle (kaggle.com/datasets/wordsforthewise/lending-club), domain peer-to-peer lending dan risiko kredit konsumen. Seluruh 2.260.668 record dipakai (151 kolom mentah; 12 fitur final setelah feature selection). Sampling hanya dilakukan untuk komputasi yang tidak feasible pada data penuh, selalu acak dan seeded (seed 42): mutual information 50.000 baris, UMAP 100.000, hierarchical clustering 12.000, dan Apriori 250.000.</w:t>
       </w:r>
     </w:p>
     <w:p>
@@ -475,7 +475,7 @@
           <w:b w:val="0"/>
           <w:i w:val="0"/>
         </w:rPr>
-        <w:t>Pembersihan tidak menghapus kolom hanya karena proporsi kosongnya tinggi. Setiap kolom bermasalah lebih dulu diberi dugaan mekanisme (structural missing, data leakage pasca-origination, atau MAR temporal) dan diverifikasi terhadap data, lalu keputusan mengikuti mekanisme itu: kolom bulan-sejak-kejadian yang kosong karena peristiwanya belum pernah terjadi diisi sentinel 999 plus flag biner, kolom leakage dibuang, kolom dengan missing di atas 40 persen dibuang, sisanya diimputasi median/modus (mort_acc diimputasi berbasis grup total_acc). Sebanyak 33 baris duplikat/tanpa label dibuang. Transformasi mencakup ordinal encoding grade dan sub_grade, binning kuantil lima fitur kontinu untuk persiapan ARM, winsorisasi data-driven pada fitur kontinu ber-|skew| di atas 1 (dengan penjaga anti-kolaps untuk fitur zero-inflated), log1p kondisional, dan standardisasi. Fitur nominal murni dibuang dari matriks clustering, bukan di-one-hot, karena one-hot mendistorsi jarak Euclidean pada clustering. Feature selection memakai dua metode: pemangkasan multikolinearitas (|r| di atas 0,85) lalu mutual information terhadap grade; hasilnya 12 fitur final. PCA sembilan komponen (90 persen varians) menjadi masukan K-Means dan hierarchical; UMAP varian densMAP menjadi masukan DBSCAN.</w:t>
+        <w:t>Pembersihan tidak menghapus kolom hanya karena proporsi kosongnya tinggi. Setiap kolom bermasalah lebih dulu diberi dugaan mekanisme (structural missing, data leakage pasca-origination, atau MAR temporal) dan diverifikasi terhadap data, lalu keputusan mengikuti mekanisme itu: kolom bulan-sejak-kejadian yang kosong karena peristiwanya belum pernah terjadi diisi sentinel 999 plus flag biner, kolom leakage dibuang, kolom dengan missing di atas 40 persen dibuang, sisanya diimputasi median/modus (mort_acc diimputasi berbasis grup total_acc). Sebanyak 33 baris duplikat/tanpa label dibuang. Transformasi mencakup ordinal encoding grade dan sub_grade, binning kuantil lima fitur kontinu untuk persiapan ARM, winsorization data-driven pada fitur kontinu ber-|skew| di atas 1 (dengan guard anti-collapse untuk fitur zero-inflated), log1p kondisional, dan standardisasi. Fitur nominal murni dibuang dari matriks clustering, bukan di-one-hot, karena one-hot mendistorsi jarak Euclidean pada clustering. Feature selection memakai dua metode: pemangkasan multikolinearitas (|r| di atas 0,85) lalu mutual information terhadap grade; hasilnya 12 fitur final. PCA sembilan komponen (90 persen varians) menjadi masukan K-Means dan hierarchical; UMAP varian densMAP menjadi masukan DBSCAN.</w:t>
       </w:r>
     </w:p>
     <w:p>
@@ -492,7 +492,7 @@
           <w:b w:val="0"/>
           <w:i w:val="0"/>
         </w:rPr>
-        <w:t>Tiga algoritma diterapkan: K-Means (MiniBatch) pada ruang PCA, hierarchical clustering, dan DBSCAN. Jumlah cluster ditetapkan dua setelah uji stabilitas lintas lima sample: kurva Elbow menurun mulus tanpa siku yang menonjolkan K tertentu, sedangkan Silhouette memilih K=2 secara konsisten (rata-rata 0,161, deviasi 0,010, menang di 4 dari 5 sample), sehingga keputusan bertumpu pada Silhouette. Untuk hierarchical, linkage average dan single menghasilkan chaining (satu cluster raksasa plus singleton) sehingga linkage Ward dipilih (cophenetic correlation 0,360; cophenetic average/single lebih tinggi tetapi strukturnya degenerate). DBSCAN pada embedding densMAP memakai eps 0,471 dan min_samples 12, keduanya data-driven (knee k-distance; pembulatan ln n), menghasilkan 501 noise point (0,50 persen). Adjusted Rand Index K-Means terhadap hierarchical 0,357 (moderat).</w:t>
+        <w:t>Tiga algoritma diterapkan: K-Means (MiniBatch) pada ruang PCA, hierarchical clustering, dan DBSCAN. Jumlah cluster ditetapkan dua setelah uji stabilitas lintas lima sample: kurva Elbow menurun mulus tanpa siku yang menonjolkan K tertentu, sedangkan Silhouette memilih K=2 secara konsisten (rata-rata 0,161, deviasi 0,010, menang di 4 dari 5 sample), sehingga keputusan bertumpu pada Silhouette. Untuk hierarchical, linkage average dan single menghasilkan chaining (satu cluster raksasa plus singleton) sehingga linkage Ward dipilih (cophenetic correlation 0,360; cophenetic average/single lebih tinggi tetapi strukturnya degenerate). DBSCAN pada embedding densMAP memakai eps 0,471 dan min_samples 12, keduanya data-driven (knee k-distance; pembulatan ln n), menghasilkan 501 noise point (0,50 persen). Adjusted Rand Index K-Means terhadap hierarchical 0,365 (moderat).</w:t>
       </w:r>
     </w:p>
     <w:p>
@@ -526,7 +526,7 @@
           <w:b w:val="0"/>
           <w:i w:val="0"/>
         </w:rPr>
-        <w:t>Deteksi mencari tiga tipe outlier: point (ekstrem satu dimensi), contextual (janggal hanya secara multivariat), dan collective (region kepadatan rendah). Empat metode dengan ambang eksplisit: IQR pengali 3, Z-score ambang 3, jarak Mahalanobis pada persentil chi-square 99,9 persen, dan Isolation Forest dengan contamination 1 persen. Nilai contamination diuji terhadap alternatif data-driven berupa pencarian gap pada kurva skor anomali terurut: kurva terbukti mulus tanpa jurang yang stabil (gap terbesar jatuh pada 0,10 persen populasi dan berpindah lokasi saat window pencarian digeser), dan pilihan cutoff nyaris tidak mengubah hasil akhir karena korroborasi minimal dua metode (115.195 berbanding 116.225 anomali terkonfirmasi), sehingga contamination 1 persen dipertahankan sebagai metode paling ketat di antara keempatnya. Deteksi berjalan pada data non-winsorized agar nilai asli tidak terhapus. Anomali terkonfirmasi bila ditandai minimal dua metode: dari 271.143 kandidat, 116.225 terkonfirmasi, lalu disilangkan dengan noise DBSCAN Phase 2.</w:t>
+        <w:t>Deteksi mencari tiga tipe outlier: point (ekstrem satu dimensi), contextual (janggal hanya secara multivariat), dan collective (region kepadatan rendah). Empat metode dengan ambang eksplisit: IQR pengali 3, Z-score ambang 3, jarak Mahalanobis pada persentil chi-square 99,9 persen, dan Isolation Forest dengan contamination 1 persen. Nilai contamination diuji terhadap alternatif data-driven berupa pencarian gap pada kurva skor anomali terurut: kurva terbukti mulus tanpa jurang yang stabil (gap terbesar jatuh pada 0,10 persen populasi dan berpindah lokasi saat window pencarian digeser), dan pilihan cutoff nyaris tidak mengubah hasil akhir karena corroboration minimal dua metode (115.195 berbanding 116.225 anomali terkonfirmasi), sehingga contamination 1 persen dipertahankan sebagai metode paling ketat di antara keempatnya. Deteksi berjalan pada data non-winsorized agar nilai asli tidak terhapus. Anomali terkonfirmasi bila ditandai minimal dua metode: dari 271.143 kandidat, 116.225 terkonfirmasi, lalu disilangkan dengan noise DBSCAN Phase 2.</w:t>
       </w:r>
     </w:p>
     <w:p>
@@ -560,7 +560,7 @@
           <w:b/>
           <w:i w:val="0"/>
         </w:rPr>
-        <w:t>62,1 persen peminjam berada di satu segmen dengan tingkat charged-off 14,4 persen, hampir dua kali lipat segmen prime (7,8 persen).</w:t>
+        <w:t>62,2 persen peminjam berada di satu segmen dengan tingkat charged-off 14,4 persen, hampir dua kali lipat segmen prime (7,7 persen).</w:t>
       </w:r>
     </w:p>
     <w:p>
@@ -577,7 +577,7 @@
           <w:b w:val="0"/>
           <w:i w:val="0"/>
         </w:rPr>
-        <w:t>Segmentasi K-Means membelah populasi menjadi dua. Cluster 0 (dinamai Higher-risk) mencakup 62,1 persen peminjam dengan tingkat charged-off 14,4 persen; Cluster 1 (Prime) mencakup 37,9 persen dengan charged-off 7,8 persen. Tingkat di sini dihitung dari status Charged Off saja (rata-rata populasi 11,9 persen). Dalam satuan simpangan baku (selisih z-score antar cluster, konsisten dengan radar profil Phase 2), pembeda paling tajam adalah FICO (1,15 SD; 684 berbanding 722), disusul ukuran pinjaman (0,87 SD; 12 ribu berbanding 20 ribu dolar) dan utilisasi revolving (0,85 SD; 58 berbanding 37 persen); gap penghasilan besar secara nominal (63 ribu berbanding 102 ribu dolar) tetapi hanya 0,35 SD karena varians penghasilan sangat lebar.</w:t>
+        <w:t>Segmentasi K-Means membelah populasi menjadi dua. Cluster 0 (dinamai Higher-risk) mencakup 62,2 persen peminjam dengan tingkat charged-off 14,4 persen; Cluster 1 (Prime) mencakup 37,8 persen dengan charged-off 7,7 persen. Tingkat di sini dihitung dari status Charged Off saja (rata-rata populasi 11,9 persen). Dalam satuan simpangan baku (selisih z-score antar cluster, konsisten dengan radar profil Phase 2), pembeda paling tajam adalah FICO (1,16 SD; 684 berbanding 723), disusul ukuran pinjaman (0,87 SD; 12 ribu berbanding 20 ribu dolar) dan utilisasi revolving (0,85 SD; 58 berbanding 37 persen); gap penghasilan besar secara nominal (63 ribu berbanding 102 ribu dolar) tetapi hanya 0,34 SD karena varians penghasilan sangat lebar.</w:t>
       </w:r>
     </w:p>
     <w:p>
@@ -594,7 +594,7 @@
           <w:b w:val="0"/>
           <w:i w:val="0"/>
         </w:rPr>
-        <w:t>Hierarchical clustering linkage Ward menghasilkan pembagian dua kelompok serupa (Adjusted Rand Index 0,357, moderat); tabel silang menempatkan mayoritas anggota pada sel yang bersesuaian. Silhouette 0,161 memang rendah, wajar untuk data sosial-ekonomi kontinu tanpa gap tajam, tetapi kestabilan pemisahan lintas lima sample memperkuat bahwa dua segmen ini nyata.</w:t>
+        <w:t>Hierarchical clustering linkage Ward menghasilkan pembagian dua kelompok serupa (Adjusted Rand Index 0,365, moderat); tabel silang menempatkan mayoritas anggota pada sel yang bersesuaian. Silhouette 0,161 memang rendah, wajar untuk data sosial-ekonomi kontinu tanpa gap tajam, tetapi kestabilan pemisahan lintas lima sample memperkuat bahwa dua segmen ini nyata.</w:t>
       </w:r>
     </w:p>
     <w:p>
@@ -7588,7 +7588,7 @@
               <w:rPr>
                 <w:sz w:val="18"/>
               </w:rPr>
-              <w:t>0,357</w:t>
+              <w:t>0,365</w:t>
             </w:r>
           </w:p>
         </w:tc>
@@ -7724,7 +7724,7 @@
               <w:rPr>
                 <w:sz w:val="18"/>
               </w:rPr>
-              <w:t>Total kandidat anomali sebelum korroborasi (≥1 metode)</w:t>
+              <w:t>Total kandidat anomali sebelum corroboration (≥1 metode)</w:t>
             </w:r>
           </w:p>
         </w:tc>

</xml_diff>

<commit_message>
Phase 5: sinkronkan laporan & dashboard dengan hasil run Phase 1-4 terbaru
- DBSCAN pada UMAP baru: eps 0,503, 3 wilayah padat, 426 noise (0,43 persen);
  cross-reference Phase 4 menjadi 68 persen, collective 204, point 115.978
- Profil outlier 'stretched high-earners' diperbarui (income 127.197, DTI 26,5,
  loan 22.090, charged-off 15,3 persen)
- Appendix A laporan diperbaiki: sebelumnya masih memuat profil cluster lama
  (62,1/37,9) karena format angka tabel lolos dari sinkronisasi teks
- 5 CSV dashboard diregenerasi dari output fase terbaru; data_layer & narasi app
  disesuaikan; istilah winsorization/guard anti-collapse diseragamkan
- K-Means, Phase 3, dan Phase 4 (kecuali cross-ref DBSCAN) tidak berubah
</commit_message>
<xml_diff>
--- a/phase5/Knowledge_Discovery_Report.docx
+++ b/phase5/Knowledge_Discovery_Report.docx
@@ -492,7 +492,7 @@
           <w:b w:val="0"/>
           <w:i w:val="0"/>
         </w:rPr>
-        <w:t>Tiga algoritma diterapkan: K-Means (MiniBatch) pada ruang PCA, hierarchical clustering, dan DBSCAN. Jumlah cluster ditetapkan dua setelah uji stabilitas lintas lima sample: kurva Elbow menurun mulus tanpa siku yang menonjolkan K tertentu, sedangkan Silhouette memilih K=2 secara konsisten (rata-rata 0,161, deviasi 0,010, menang di 4 dari 5 sample), sehingga keputusan bertumpu pada Silhouette. Untuk hierarchical, linkage average dan single menghasilkan chaining (satu cluster raksasa plus singleton) sehingga linkage Ward dipilih (cophenetic correlation 0,360; cophenetic average/single lebih tinggi tetapi strukturnya degenerate). DBSCAN pada embedding densMAP memakai eps 0,471 dan min_samples 12, keduanya data-driven (knee k-distance; pembulatan ln n), menghasilkan 501 noise point (0,50 persen). Adjusted Rand Index K-Means terhadap hierarchical 0,365 (moderat).</w:t>
+        <w:t>Tiga algoritma diterapkan: K-Means (MiniBatch) pada ruang PCA, hierarchical clustering, dan DBSCAN. Jumlah cluster ditetapkan dua setelah uji stabilitas lintas lima sample: kurva Elbow menurun mulus tanpa siku yang menonjolkan K tertentu, sedangkan Silhouette memilih K=2 secara konsisten (rata-rata 0,161, deviasi 0,010, menang di 4 dari 5 sample), sehingga keputusan bertumpu pada Silhouette. Untuk hierarchical, linkage average dan single menghasilkan chaining (satu cluster raksasa plus singleton) sehingga linkage Ward dipilih (cophenetic correlation 0,360; cophenetic average/single lebih tinggi tetapi strukturnya degenerate). DBSCAN pada embedding densMAP memakai eps 0,503 dan min_samples 12, keduanya data-driven (knee k-distance; pembulatan ln n), menghasilkan 426 noise point (0,43 persen). Adjusted Rand Index K-Means terhadap hierarchical 0,365 (moderat).</w:t>
       </w:r>
     </w:p>
     <w:p>
@@ -764,7 +764,7 @@
           <w:b w:val="0"/>
           <w:i w:val="0"/>
         </w:rPr>
-        <w:t>Karena sub-kelompok dibentuk sebelum melihat outcome, angka 19,2 persen adalah validasi, bukan definisi berputar. Deteksi saling menguatkan lintas metode: dari 501 noise DBSCAN Phase 2, 66 persen ikut ditandai metode statistik atau Isolation Forest. Terpisah dari itu, 2.654 anomali terklasifikasi data error murni (misalnya penghasilan 110 juta dolar, atau DTI bernilai sentinel 999).</w:t>
+        <w:t>Karena sub-kelompok dibentuk sebelum melihat outcome, angka 19,2 persen adalah validasi, bukan definisi berputar. Deteksi saling menguatkan lintas metode: dari 426 noise DBSCAN Phase 2, 68 persen ikut ditandai metode statistik atau Isolation Forest. Terpisah dari itu, 2.654 anomali terklasifikasi data error murni (misalnya penghasilan 110 juta dolar, atau DTI bernilai sentinel 999).</w:t>
       </w:r>
     </w:p>
     <w:p>
@@ -823,7 +823,7 @@
           <w:b w:val="0"/>
           <w:i w:val="0"/>
         </w:rPr>
-        <w:t>Deteksi anomali berjalan pada 12 fitur numerik terpilih dan sebagian besar menemukan point outlier (115.945 dari 116.225); contextual murni (43) dan collective (237) sangat sedikit, sebagian karena fitur finansial berekor berat pada dimensi tunggal, sebagian karena keterbatasan ruang fitur. Anomali yang hanya muncul pada fitur yang dibuang saat feature selection tidak tertangkap.</w:t>
+        <w:t>Deteksi anomali berjalan pada 12 fitur numerik terpilih dan sebagian besar menemukan point outlier (115.978 dari 116.225); contextual murni (43) dan collective (204) sangat sedikit, sebagian karena fitur finansial berekor berat pada dimensi tunggal, sebagian karena keterbatasan ruang fitur. Anomali yang hanya muncul pada fitur yang dibuang saat feature selection tidak tertangkap.</w:t>
       </w:r>
     </w:p>
     <w:p>
@@ -1139,7 +1139,7 @@
               <w:rPr>
                 <w:sz w:val="16"/>
               </w:rPr>
-              <w:t>62.1</w:t>
+              <w:t>62.2</w:t>
             </w:r>
           </w:p>
         </w:tc>
@@ -1167,7 +1167,7 @@
               <w:rPr>
                 <w:sz w:val="16"/>
               </w:rPr>
-              <w:t>63,231</w:t>
+              <w:t>63,474</w:t>
             </w:r>
           </w:p>
         </w:tc>
@@ -1195,7 +1195,7 @@
               <w:rPr>
                 <w:sz w:val="16"/>
               </w:rPr>
-              <w:t>58.3</w:t>
+              <w:t>58.4</w:t>
             </w:r>
           </w:p>
         </w:tc>
@@ -1223,7 +1223,7 @@
               <w:rPr>
                 <w:sz w:val="16"/>
               </w:rPr>
-              <w:t>12,003</w:t>
+              <w:t>12,086</w:t>
             </w:r>
           </w:p>
         </w:tc>
@@ -1251,7 +1251,7 @@
               <w:rPr>
                 <w:sz w:val="16"/>
               </w:rPr>
-              <w:t>41.6</w:t>
+              <w:t>41.7</w:t>
             </w:r>
           </w:p>
         </w:tc>
@@ -1309,7 +1309,7 @@
               <w:rPr>
                 <w:sz w:val="16"/>
               </w:rPr>
-              <w:t>37.9</w:t>
+              <w:t>37.8</w:t>
             </w:r>
           </w:p>
         </w:tc>
@@ -1323,7 +1323,7 @@
               <w:rPr>
                 <w:sz w:val="16"/>
               </w:rPr>
-              <w:t>7.8</w:t>
+              <w:t>7.7</w:t>
             </w:r>
           </w:p>
         </w:tc>
@@ -1337,7 +1337,7 @@
               <w:rPr>
                 <w:sz w:val="16"/>
               </w:rPr>
-              <w:t>102,222</w:t>
+              <w:t>101,922</w:t>
             </w:r>
           </w:p>
         </w:tc>
@@ -1365,7 +1365,7 @@
               <w:rPr>
                 <w:sz w:val="16"/>
               </w:rPr>
-              <w:t>37.3</w:t>
+              <w:t>37.0</w:t>
             </w:r>
           </w:p>
         </w:tc>
@@ -1379,7 +1379,7 @@
               <w:rPr>
                 <w:sz w:val="16"/>
               </w:rPr>
-              <w:t>17.6</w:t>
+              <w:t>17.5</w:t>
             </w:r>
           </w:p>
         </w:tc>
@@ -1393,7 +1393,7 @@
               <w:rPr>
                 <w:sz w:val="16"/>
               </w:rPr>
-              <w:t>20,043</w:t>
+              <w:t>19,927</w:t>
             </w:r>
           </w:p>
         </w:tc>
@@ -1421,7 +1421,7 @@
               <w:rPr>
                 <w:sz w:val="16"/>
               </w:rPr>
-              <w:t>45.0</w:t>
+              <w:t>44.9</w:t>
             </w:r>
           </w:p>
         </w:tc>
@@ -1448,7 +1448,7 @@
           <w:i w:val="0"/>
           <w:sz w:val="18"/>
         </w:rPr>
-        <w:t>CO % = tingkat Charged Off (definisi sempit). Profil outlier DBSCAN (501 noise): income rata-rata 117.758 dolar, DTI 25,7, loan 21.459 dolar, charged-off 15,8 persen (populasi 11,9) — profil 'stretched high-earners'.</w:t>
+        <w:t>CO % = tingkat Charged Off (definisi sempit). Profil outlier DBSCAN (426 noise): income rata-rata 127.197 dolar, DTI 26,5, loan 22.090 dolar, charged-off 15,3 persen (populasi 11,9) — profil 'stretched high-earners'.</w:t>
       </w:r>
     </w:p>
     <w:p>

</xml_diff>

<commit_message>
Laporan: nyatakan nilai Elbow pada K final (369.751) dan laporkan Precision/Recall flag risk_signal sesuai template; perbaiki label node rule network
</commit_message>
<xml_diff>
--- a/phase5/Knowledge_Discovery_Report.docx
+++ b/phase5/Knowledge_Discovery_Report.docx
@@ -492,7 +492,7 @@
           <w:b w:val="0"/>
           <w:i w:val="0"/>
         </w:rPr>
-        <w:t>Tiga algoritma diterapkan: K-Means (MiniBatch) pada ruang PCA, hierarchical clustering, dan DBSCAN. Jumlah cluster ditetapkan dua setelah uji stabilitas lintas lima sample: kurva Elbow menurun mulus tanpa siku yang menonjolkan K tertentu, sedangkan Silhouette memilih K=2 secara konsisten (rata-rata 0,161, deviasi 0,010, menang di 4 dari 5 sample), sehingga keputusan bertumpu pada Silhouette. Untuk hierarchical, linkage average dan single menghasilkan chaining (satu cluster raksasa plus singleton) sehingga linkage Ward dipilih (cophenetic correlation 0,360; cophenetic average/single lebih tinggi tetapi strukturnya degenerate). DBSCAN pada embedding densMAP memakai eps 0,503 dan min_samples 12, keduanya data-driven (knee k-distance; pembulatan ln n), menghasilkan 426 noise point (0,43 persen). Adjusted Rand Index K-Means terhadap hierarchical 0,365 (moderat).</w:t>
+        <w:t>Tiga algoritma diterapkan: K-Means (MiniBatch) pada ruang PCA, hierarchical clustering, dan DBSCAN. Jumlah cluster ditetapkan dua setelah uji stabilitas lintas lima sample. Pada K=2, nilai Elbow (inertia rata-rata) adalah 369.751 dan Silhouette 0,161 (deviasi 0,010). Kurva inertia menurun mulus (369.751 pada K=2; 327.805 pada K=3; 305.776 pada K=4) tanpa siku yang menonjolkan K tertentu, sedangkan Silhouette memilih K=2 secara konsisten (menang di 4 dari 5 sample), sehingga keputusan bertumpu pada Silhouette. Untuk hierarchical, linkage average dan single menghasilkan chaining (satu cluster raksasa plus singleton) sehingga linkage Ward dipilih (cophenetic correlation 0,360; cophenetic average/single lebih tinggi tetapi strukturnya degenerate). DBSCAN pada embedding densMAP memakai eps 0,503 dan min_samples 12, keduanya data-driven (knee k-distance; pembulatan ln n), menghasilkan 426 noise point (0,43 persen). Adjusted Rand Index K-Means terhadap hierarchical 0,365 (moderat).</w:t>
       </w:r>
     </w:p>
     <w:p>
@@ -577,7 +577,7 @@
           <w:b w:val="0"/>
           <w:i w:val="0"/>
         </w:rPr>
-        <w:t>Segmentasi K-Means membelah populasi menjadi dua. Cluster 0 (dinamai Higher-risk) mencakup 62,2 persen peminjam dengan tingkat charged-off 14,4 persen; Cluster 1 (Prime) mencakup 37,8 persen dengan charged-off 7,7 persen. Tingkat di sini dihitung dari status Charged Off saja (rata-rata populasi 11,9 persen). Dalam satuan simpangan baku (selisih z-score antar cluster, konsisten dengan radar profil Phase 2), pembeda paling tajam adalah FICO (1,16 SD; 684 berbanding 723), disusul utilisasi revolving (0,87 SD; 58 berbanding 37 persen) dan ukuran pinjaman (0,85 SD; 12 ribu berbanding 20 ribu dolar); gap penghasilan besar secara nominal (63 ribu berbanding 102 ribu dolar) tetapi hanya 0,34 SD karena varians penghasilan sangat lebar.</w:t>
+        <w:t>Segmentasi K-Means membelah populasi menjadi dua. Cluster 0 (dinamai Higher-risk) mencakup 62,2 persen peminjam dengan tingkat charged-off 14,4 persen; Cluster 1 (Prime) mencakup 37,8 persen dengan charged-off 7,7 persen. Tingkat di sini dihitung dari status Charged Off saja (rata-rata populasi 11,9 persen). Dalam satuan simpangan baku (selisih z-score antar cluster, konsisten dengan radar profil Phase 2), pembeda paling tajam adalah FICO (1,16 SD; 684 berbanding 723), disusul ukuran pinjaman (0,87 SD; 12 ribu berbanding 20 ribu dolar) dan utilisasi revolving (0,85 SD; 58 berbanding 37 persen); gap penghasilan besar secara nominal (63 ribu berbanding 102 ribu dolar) tetapi hanya 0,34 SD karena varians penghasilan sangat lebar.</w:t>
       </w:r>
     </w:p>
     <w:p>
@@ -7784,7 +7784,7 @@
               <w:rPr>
                 <w:sz w:val="18"/>
               </w:rPr>
-              <w:t>Precision/Recall vs label</w:t>
+              <w:t>Precision/Recall flag risk_signal vs label outcome</w:t>
             </w:r>
           </w:p>
         </w:tc>
@@ -7798,7 +7798,7 @@
               <w:rPr>
                 <w:sz w:val="18"/>
               </w:rPr>
-              <w:t>Tidak berlaku (unsupervised; label outcome hanya untuk validasi)</w:t>
+              <w:t>Precision 19,2% (baseline populasi 13,1%; lift 1,47x) · Recall 0,74% · flag bersifat sangat selektif (0,50% populasi) dan tidak dioptimalkan sebagai classifier</w:t>
             </w:r>
           </w:p>
         </w:tc>

</xml_diff>

<commit_message>
Laporan: jawab pertanyaan sentral secara eksplisit; README: dokumentasikan status deliverable clean dataset file
</commit_message>
<xml_diff>
--- a/phase5/Knowledge_Discovery_Report.docx
+++ b/phase5/Knowledge_Discovery_Report.docx
@@ -433,7 +433,7 @@
           <w:b w:val="0"/>
           <w:i w:val="0"/>
         </w:rPr>
-        <w:t>Analisis KDD atas 2.260.668 pinjaman Lending Club menemukan bahwa risiko gagal bayar terkonsentrasi pada segmen mayoritas: 62,2 persen peminjam berada dalam satu segmen dengan tingkat charged-off 14,4 persen, hampir dua kali lipat segmen prime (7,7 persen), dan segmen ini terpisah paling tajam pada kombinasi FICO, utilisasi revolving, dan ukuran pinjaman. Dua hal yang belum tercermin dalam praktik saat ini: grade internal hampir sepenuhnya cerminan suku bunga (hanya 1 dari 1.023 aturan asosiasi yang memprediksi Grade A tanpa suku bunga), dan outlier statistik justru didominasi nasabah affluent yang membayar lancar (bad-rate 8,7 persen vs populasi 13,1 persen). Bank sebaiknya mengkalibrasi harga dan limit pada kombinasi atribut tersebut, dan mengganti flag berbasis outlier dengan aturan kombinasi atribut tekanan kredit yang tervalidasi menaikkan risiko gagal bayar 1,47 kali (19,2 persen).</w:t>
+        <w:t>Pertanyaan sentral proyek ini adalah apa yang ditemukan yang tidak terlihat langsung dari data mentah. Jawabannya: analisis KDD atas 2.260.668 pinjaman Lending Club menemukan bahwa risiko gagal bayar terkonsentrasi pada segmen mayoritas: 62,2 persen peminjam berada dalam satu segmen dengan tingkat charged-off 14,4 persen, hampir dua kali lipat segmen prime (7,7 persen), dan segmen ini terpisah paling tajam pada kombinasi FICO, utilisasi revolving, dan ukuran pinjaman. Dua hal yang belum tercermin dalam praktik saat ini: grade internal hampir sepenuhnya cerminan suku bunga (hanya 1 dari 1.023 aturan asosiasi yang memprediksi Grade A tanpa suku bunga), dan outlier statistik justru didominasi nasabah affluent yang membayar lancar (bad-rate 8,7 persen vs populasi 13,1 persen). Bank sebaiknya mengkalibrasi harga dan limit pada kombinasi atribut tersebut, dan mengganti flag berbasis outlier dengan aturan kombinasi atribut tekanan kredit yang tervalidasi menaikkan risiko gagal bayar 1,47 kali (19,2 persen).</w:t>
       </w:r>
     </w:p>
     <w:p>
@@ -543,7 +543,7 @@
           <w:b w:val="0"/>
           <w:i/>
         </w:rPr>
-        <w:t>Setiap temuan berasal dari fase berbeda, memuat angka dari analisis, tidak terlihat langsung dari data mentah, mengimplikasikan tindakan bank spesifik, dan menghindari klaim kausal.</w:t>
+        <w:t>Ketiga temuan berikut adalah jawaban rinci atas pertanyaan sentral: masing-masing hanya muncul setelah penambangan dan tidak terbaca dari tabulasi maupun agregasi sederhana atas data mentah. Setiap temuan berasal dari fase berbeda, memuat angka dari analisis, mengimplikasikan tindakan bank spesifik, dan menghindari klaim kausal.</w:t>
       </w:r>
     </w:p>
     <w:p>

</xml_diff>

<commit_message>
Appendix D: beri konteks batas atas recall pada baris Precision/Recall agar terbaca sebagai sifat desain flag triase
</commit_message>
<xml_diff>
--- a/phase5/Knowledge_Discovery_Report.docx
+++ b/phase5/Knowledge_Discovery_Report.docx
@@ -7182,7 +7182,7 @@
               <w:rPr>
                 <w:sz w:val="18"/>
               </w:rPr>
-              <w:t>Precision/Recall flag risk_signal vs label outcome</w:t>
+              <w:t>Precision / Recall vs. label (flag risk_signal)</w:t>
             </w:r>
           </w:p>
         </w:tc>
@@ -7196,7 +7196,7 @@
               <w:rPr>
                 <w:sz w:val="18"/>
               </w:rPr>
-              <w:t>Precision 19,2% (baseline populasi 13,1%; lift 1,47x) · Recall 0,74% · flag bersifat sangat selektif (0,50% populasi) dan tidak dioptimalkan sebagai classifier</w:t>
+              <w:t>Precision 19,2 persen vs baseline populasi 13,1 persen (lift 1,47x) · Recall 0,74 persen dari batas atas 3,85 persen — flag hanya menandai 0,50 persen populasi (11.358 baris) sehingga recall maksimum yang mungkin memang 3,85 persen; capaian setara 19 persen dari batas atas itu. Flag ini aturan triase untuk kapasitas review manual, bukan classifier: memperluas cakupan ke seluruh 116.225 anomali justru menurunkan precision ke 8,7 persen, di bawah baseline.</w:t>
             </w:r>
           </w:p>
         </w:tc>

</xml_diff>